<commit_message>
Rewrite presenter script as formatted User and Talia dialogue
</commit_message>
<xml_diff>
--- a/demo-pack/Barclays-demo-presenter-script.docx
+++ b/demo-pack/Barclays-demo-presenter-script.docx
@@ -12,242 +12,335 @@
     </w:p>
     <w:p>
       <w:r>
+        <w:t xml:space="preserve">Follow the dialogue in order. </w:t>
+      </w:r>
+      <w:r>
         <w:rPr>
           <w:b/>
         </w:rPr>
-        <w:t xml:space="preserve">Open </w:t>
+        <w:t xml:space="preserve">Bold text is what you paste into the chat. </w:t>
       </w:r>
       <w:r>
-        <w:t>https://yonahs-wonderful.github.io/barclays-sme-lending/</w:t>
+        <w:rPr>
+          <w:i/>
+        </w:rPr>
+        <w:t xml:space="preserve">Italic text is Talia’s expected reply. </w:t>
+      </w:r>
+      <w:r>
+        <w:t>Click and upload instructions are in plain text; do not paste them.</w:t>
+      </w:r>
+    </w:p>
+    <w:p>
+      <w:hyperlink r:id="rId9">
+        <w:r>
+          <w:rPr>
+            <w:color w:val="0076A8"/>
+          </w:rPr>
+          <w:t>Open Talia’s frontend</w:t>
+        </w:r>
+      </w:hyperlink>
+    </w:p>
+    <w:p>
+      <w:r>
+        <w:t>Before starting: reload for a fresh session. Have the two PDFs ready and keep USA / Barclays Activities open. Wait for each response or widget before continuing.</w:t>
+      </w:r>
+    </w:p>
+    <w:p>
+      <w:pPr>
+        <w:pStyle w:val="Heading1"/>
+      </w:pPr>
+      <w:r>
+        <w:t>Start and choose the facility</w:t>
+      </w:r>
+    </w:p>
+    <w:p>
+      <w:pPr>
+        <w:keepLines/>
+      </w:pPr>
+      <w:r>
+        <w:rPr>
+          <w:b w:val="0"/>
+        </w:rPr>
+        <w:t xml:space="preserve">User: </w:t>
+      </w:r>
+      <w:r>
+        <w:rPr>
+          <w:b w:val="0"/>
+          <w:i w:val="0"/>
+        </w:rPr>
+        <w:t>Click Talk to Talia.</w:t>
+      </w:r>
+    </w:p>
+    <w:p>
+      <w:pPr>
+        <w:keepLines/>
+      </w:pPr>
+      <w:r>
+        <w:rPr>
+          <w:b w:val="0"/>
+        </w:rPr>
+        <w:t xml:space="preserve">Talia: </w:t>
+      </w:r>
+      <w:r>
+        <w:rPr>
+          <w:b w:val="0"/>
+          <w:i/>
+        </w:rPr>
+        <w:t>Hi James, I'm Talia, your Barclays relationship banking assistant. What can I help with today?</w:t>
+      </w:r>
+    </w:p>
+    <w:p>
+      <w:pPr>
+        <w:keepLines/>
+      </w:pPr>
+      <w:r>
+        <w:rPr>
+          <w:b w:val="0"/>
+        </w:rPr>
+        <w:t xml:space="preserve">User: </w:t>
+      </w:r>
+      <w:r>
+        <w:rPr>
+          <w:b/>
+          <w:i w:val="0"/>
+        </w:rPr>
+        <w:t>I've just signed a new contract with a major automotive manufacturer and need a £300,000 increase to my credit facility to fund it</w:t>
+      </w:r>
+    </w:p>
+    <w:p>
+      <w:pPr>
+        <w:keepLines/>
+      </w:pPr>
+      <w:r>
+        <w:rPr>
+          <w:b w:val="0"/>
+        </w:rPr>
+        <w:t xml:space="preserve">Talia: </w:t>
+      </w:r>
+      <w:r>
+        <w:rPr>
+          <w:b w:val="0"/>
+          <w:i/>
+        </w:rPr>
+        <w:t>Right, I can help with that. I can see Thornfield already has a £200,000 revolving credit facility. The file will test your requested £300,000 increase against policy, serviceability and the signed contract, then propose a £500,000 limit if it holds.</w:t>
+      </w:r>
+    </w:p>
+    <w:p>
+      <w:pPr>
+        <w:keepLines/>
+      </w:pPr>
+      <w:r>
+        <w:rPr>
+          <w:b w:val="0"/>
+        </w:rPr>
+        <w:t xml:space="preserve">Talia: </w:t>
+      </w:r>
+      <w:r>
+        <w:rPr>
+          <w:b w:val="0"/>
+          <w:i/>
+        </w:rPr>
+        <w:t>Here are two facility options for the new contract. Review them below, then confirm the path you'd like to take.</w:t>
+      </w:r>
+    </w:p>
+    <w:p>
+      <w:pPr>
+        <w:keepLines/>
+      </w:pPr>
+      <w:r>
+        <w:rPr>
+          <w:b w:val="0"/>
+        </w:rPr>
+        <w:t xml:space="preserve">User: </w:t>
+      </w:r>
+      <w:r>
+        <w:rPr>
+          <w:b w:val="0"/>
+          <w:i w:val="0"/>
+        </w:rPr>
+        <w:t>Select RCF amendment + FX hedge, then click Confirm &amp; continue. This is a widget action; no message needs to be typed.</w:t>
+      </w:r>
+    </w:p>
+    <w:p>
+      <w:pPr>
+        <w:keepLines/>
+      </w:pPr>
+      <w:r>
+        <w:rPr>
+          <w:b w:val="0"/>
+        </w:rPr>
+        <w:t xml:space="preserve">Talia: </w:t>
+      </w:r>
+      <w:r>
+        <w:rPr>
+          <w:b w:val="0"/>
+          <w:i/>
+        </w:rPr>
+        <w:t>Great. I've added your choice to the file and reused the existing KYC, UBO declaration, director IDs, 2022/2023 accounts, prior credit memo, and current facility details. I only need two new documents: please upload the 2024 management accounts and the signed contract below.</w:t>
+      </w:r>
+    </w:p>
+    <w:p>
+      <w:pPr>
+        <w:keepLines/>
+      </w:pPr>
+      <w:r>
+        <w:rPr>
+          <w:b w:val="0"/>
+        </w:rPr>
+        <w:t xml:space="preserve">User: </w:t>
+      </w:r>
+      <w:r>
+        <w:rPr>
+          <w:b w:val="0"/>
+          <w:i w:val="0"/>
+        </w:rPr>
+        <w:t>Upload Thornfield_2024_Management_Accounts.pdf and Signed_Contract.pdf using the upload box. Wait for both scans and both replies. No typed upload notification is needed.</w:t>
       </w:r>
     </w:p>
     <w:p>
       <w:r>
-        <w:rPr>
-          <w:b/>
-        </w:rPr>
-        <w:t xml:space="preserve">Have ready </w:t>
-      </w:r>
-      <w:r>
-        <w:t>Thornfield_2024_Management_Accounts.pdf and Signed_Contract.pdf. Reload the page for a fresh session and keep Wonderful Activities open.</w:t>
+        <w:br w:type="page"/>
       </w:r>
     </w:p>
     <w:p>
       <w:pPr>
-        <w:pStyle w:val="Heading2"/>
+        <w:pStyle w:val="Title"/>
       </w:pPr>
       <w:r>
-        <w:t>1 Introduce the customer</w:t>
+        <w:t>Review the checks and submit</w:t>
+      </w:r>
+    </w:p>
+    <w:p>
+      <w:pPr>
+        <w:keepLines/>
+      </w:pPr>
+      <w:r>
+        <w:rPr>
+          <w:b w:val="0"/>
+        </w:rPr>
+        <w:t xml:space="preserve">Talia: </w:t>
+      </w:r>
+      <w:r>
+        <w:rPr>
+          <w:b w:val="0"/>
+          <w:i/>
+        </w:rPr>
+        <w:t>Okay, the 2024 management accounts are validated. Revenue is up 10% year on year, EBITDA is £620,000, DSCR is 2.1x, leverage is 34%, and current ratio is 1.6x.</w:t>
+      </w:r>
+    </w:p>
+    <w:p>
+      <w:pPr>
+        <w:keepLines/>
+      </w:pPr>
+      <w:r>
+        <w:rPr>
+          <w:b w:val="0"/>
+        </w:rPr>
+        <w:t xml:space="preserve">Talia: </w:t>
+      </w:r>
+      <w:r>
+        <w:rPr>
+          <w:b w:val="0"/>
+          <w:i/>
+        </w:rPr>
+        <w:t>Now, the signed contract is validated. I found one variance: the management accounts reference a £780,000 pipeline value, while the signed contract value is £760,000. The requested £300,000 headroom is about 39% of the signed contract value and still passes the serviceability checks, so I'll flag the variance for Sarah Chen and send the case for credit review.</w:t>
+      </w:r>
+    </w:p>
+    <w:p>
+      <w:pPr>
+        <w:keepLines/>
+      </w:pPr>
+      <w:r>
+        <w:rPr>
+          <w:b w:val="0"/>
+        </w:rPr>
+        <w:t xml:space="preserve">User: </w:t>
+      </w:r>
+      <w:r>
+        <w:rPr>
+          <w:b w:val="0"/>
+          <w:i w:val="0"/>
+        </w:rPr>
+        <w:t>Review the variance, select Business Current Account ending 2910, then click Use this account once. This button submits the case; do not type a second submission.</w:t>
+      </w:r>
+    </w:p>
+    <w:p>
+      <w:pPr>
+        <w:keepLines/>
+      </w:pPr>
+      <w:r>
+        <w:rPr>
+          <w:b w:val="0"/>
+        </w:rPr>
+        <w:t xml:space="preserve">Talia: </w:t>
+      </w:r>
+      <w:r>
+        <w:rPr>
+          <w:b w:val="0"/>
+          <w:i/>
+        </w:rPr>
+        <w:t>Done. Your RCF increase case is now with Sarah Chen for credit officer review today. The prepared memo shows the amount bridge clearly: £200,000 existing limit plus your requested £300,000 increase equals a proposed £500,000 limit at SONIA + 2.8%, with the risk grade unchanged at Medium.</w:t>
+      </w:r>
+    </w:p>
+    <w:p>
+      <w:pPr>
+        <w:keepLines/>
+      </w:pPr>
+      <w:r>
+        <w:rPr>
+          <w:b w:val="0"/>
+        </w:rPr>
+        <w:t xml:space="preserve">User: </w:t>
+      </w:r>
+      <w:r>
+        <w:rPr>
+          <w:b w:val="0"/>
+          <w:i w:val="0"/>
+        </w:rPr>
+        <w:t>Wait for the submission card and application status tracker. Open the new CoreBank Lending Entry task in USA / Barclays Activities to show the computer agent entering the application.</w:t>
+      </w:r>
+    </w:p>
+    <w:p>
+      <w:hyperlink r:id="rId10">
+        <w:r>
+          <w:rPr>
+            <w:color w:val="0076A8"/>
+          </w:rPr>
+          <w:t>Open USA / Barclays Activities</w:t>
+        </w:r>
+      </w:hyperlink>
+    </w:p>
+    <w:p>
+      <w:pPr>
+        <w:pStyle w:val="Heading1"/>
+      </w:pPr>
+      <w:r>
+        <w:t>Presenter notes</w:t>
       </w:r>
     </w:p>
     <w:p>
       <w:r>
-        <w:rPr>
-          <w:b/>
-        </w:rPr>
-        <w:t xml:space="preserve">Say </w:t>
-      </w:r>
-      <w:r>
-        <w:t>“I’m James, who runs Thornfield Precision Engineering. I’ve signed a new automotive contract and need additional working capital.”</w:t>
+        <w:t>The £200,000 existing limit plus the £300,000 increase produces a proposed £500,000 limit. The £20,000 difference between pipeline and signed value is intentional and is surfaced for credit review.</w:t>
       </w:r>
     </w:p>
     <w:p>
       <w:r>
-        <w:rPr>
-          <w:b/>
-        </w:rPr>
-        <w:t xml:space="preserve">Click </w:t>
-      </w:r>
-      <w:r>
-        <w:t>Talk to Talia. Wait for the greeting.</w:t>
-      </w:r>
-    </w:p>
-    <w:p>
-      <w:pPr>
-        <w:pStyle w:val="Heading2"/>
-      </w:pPr>
-      <w:r>
-        <w:t>2 Make the request</w:t>
+        <w:t>The conversation and computer automation are live. Customer details, document checks and credit-review wording are demonstration fixtures. No real credit approval, officer notification or lending transaction occurs.</w:t>
       </w:r>
     </w:p>
     <w:p>
       <w:r>
-        <w:rPr>
-          <w:b/>
-        </w:rPr>
-        <w:t xml:space="preserve">Type </w:t>
-      </w:r>
-      <w:r>
-        <w:t>I've just signed a new contract with a major automotive manufacturer and need a £300,000 increase to my credit facility to fund it</w:t>
+        <w:t>Submission and computer-task completion are separate milestones. Wait for the actual task status to show Completed before saying the form entry is finished. The later chat message labelled “Demo confirmation · simulated” is a presentation timer, not proof of task completion.</w:t>
       </w:r>
     </w:p>
     <w:p>
       <w:r>
-        <w:rPr>
-          <w:b/>
-        </w:rPr>
-        <w:t xml:space="preserve">Wait </w:t>
-      </w:r>
-      <w:r>
-        <w:t>For the finance options to appear.</w:t>
-      </w:r>
-    </w:p>
-    <w:p>
-      <w:pPr>
-        <w:pStyle w:val="Heading2"/>
-      </w:pPr>
-      <w:r>
-        <w:t>3 Choose the facility</w:t>
-      </w:r>
-    </w:p>
-    <w:p>
-      <w:r>
-        <w:rPr>
-          <w:b/>
-        </w:rPr>
-        <w:t xml:space="preserve">Say </w:t>
-      </w:r>
-      <w:r>
-        <w:t>“The existing facility is £200,000. We’re requesting an additional £300,000, bringing the proposed limit to £500,000.”</w:t>
-      </w:r>
-    </w:p>
-    <w:p>
-      <w:r>
-        <w:rPr>
-          <w:b/>
-        </w:rPr>
-        <w:t xml:space="preserve">Click </w:t>
-      </w:r>
-      <w:r>
-        <w:t>RCF amendment + FX hedge, then Confirm &amp; continue.</w:t>
-      </w:r>
-    </w:p>
-    <w:p>
-      <w:pPr>
-        <w:pStyle w:val="Heading2"/>
-      </w:pPr>
-      <w:r>
-        <w:t>4 Upload the documents</w:t>
-      </w:r>
-    </w:p>
-    <w:p>
-      <w:r>
-        <w:rPr>
-          <w:b/>
-        </w:rPr>
-        <w:t xml:space="preserve">Say </w:t>
-      </w:r>
-      <w:r>
-        <w:t>“The demo reuses six documents already on file and asks for just two new items.”</w:t>
-      </w:r>
-    </w:p>
-    <w:p>
-      <w:r>
-        <w:rPr>
-          <w:b/>
-        </w:rPr>
-        <w:t xml:space="preserve">Upload </w:t>
-      </w:r>
-      <w:r>
-        <w:t>Thornfield_2024_Management_Accounts.pdf and Signed_Contract.pdf.</w:t>
-      </w:r>
-    </w:p>
-    <w:p>
-      <w:r>
-        <w:rPr>
-          <w:b/>
-        </w:rPr>
-        <w:t xml:space="preserve">Wait </w:t>
-      </w:r>
-      <w:r>
-        <w:t>For both scans and both agent responses to finish.</w:t>
-      </w:r>
-    </w:p>
-    <w:p>
-      <w:r>
-        <w:rPr>
-          <w:b/>
-        </w:rPr>
-        <w:t xml:space="preserve">Say </w:t>
-      </w:r>
-      <w:r>
-        <w:t>“The seeded analysis flags a difference: £780,000 in the pipeline versus £760,000 in the signed contract. That variance is surfaced for credit review.”</w:t>
-      </w:r>
-    </w:p>
-    <w:p>
-      <w:pPr>
-        <w:pStyle w:val="Heading2"/>
-      </w:pPr>
-      <w:r>
-        <w:t>5 Submit the case</w:t>
-      </w:r>
-    </w:p>
-    <w:p>
-      <w:r>
-        <w:rPr>
-          <w:b/>
-        </w:rPr>
-        <w:t xml:space="preserve">Click </w:t>
-      </w:r>
-      <w:r>
-        <w:t>Business current account ending 2910, then Use this account. This submits the case; click once.</w:t>
-      </w:r>
-    </w:p>
-    <w:p>
-      <w:r>
-        <w:rPr>
-          <w:b/>
-        </w:rPr>
-        <w:t xml:space="preserve">Wait </w:t>
-      </w:r>
-      <w:r>
-        <w:t>For the submission confirmation and status tracker.</w:t>
-      </w:r>
-    </w:p>
-    <w:p>
-      <w:pPr>
-        <w:pStyle w:val="Heading2"/>
-      </w:pPr>
-      <w:r>
-        <w:t>6 Show the computer agent</w:t>
-      </w:r>
-    </w:p>
-    <w:p>
-      <w:r>
-        <w:rPr>
-          <w:b/>
-        </w:rPr>
-        <w:t xml:space="preserve">Say </w:t>
-      </w:r>
-      <w:r>
-        <w:t>“The live conversational agent has handed the application to a computer-use agent, which enters it into our demonstration back-office system.”</w:t>
-      </w:r>
-    </w:p>
-    <w:p>
-      <w:r>
-        <w:rPr>
-          <w:b/>
-        </w:rPr>
-        <w:t xml:space="preserve">Show </w:t>
-      </w:r>
-      <w:r>
-        <w:t>The new task in Wonderful Activities. Wait for Completed before saying the form entry is finished.</w:t>
-      </w:r>
-    </w:p>
-    <w:p>
-      <w:r>
-        <w:rPr>
-          <w:b/>
-        </w:rPr>
-        <w:t xml:space="preserve">If asked </w:t>
-      </w:r>
-      <w:r>
-        <w:t>“The conversation and computer automation are live. Customer data and document-analysis results are simulated; no real credit approval or lending transaction occurs.”</w:t>
+        <w:t>If a response is delayed, wait for it rather than clicking again. The wording above follows the standard happy path; additional questions can produce different replies.</w:t>
       </w:r>
     </w:p>
     <w:sectPr>
       <w:pgSz w:w="12240" w:h="15840"/>
-      <w:pgMar w:top="936" w:right="1152" w:bottom="936" w:left="1152" w:header="720" w:footer="720" w:gutter="0"/>
+      <w:pgMar w:top="936" w:right="1080" w:bottom="936" w:left="1080" w:header="720" w:footer="720" w:gutter="0"/>
       <w:cols w:space="720"/>
       <w:docGrid w:linePitch="360"/>
     </w:sectPr>
@@ -619,7 +712,7 @@
     <w:qFormat/>
     <w:rsid w:val="00FC693F"/>
     <w:pPr>
-      <w:spacing w:after="120"/>
+      <w:spacing w:after="160" w:line="259" w:lineRule="auto"/>
     </w:pPr>
     <w:rPr>
       <w:rFonts w:ascii="Arial" w:hAnsi="Arial"/>
@@ -686,11 +779,11 @@
       <w:outlineLvl w:val="0"/>
     </w:pPr>
     <w:rPr>
-      <w:rFonts w:asciiTheme="majorHAnsi" w:eastAsiaTheme="majorEastAsia" w:hAnsiTheme="majorHAnsi" w:cstheme="majorBidi"/>
+      <w:rFonts w:asciiTheme="majorHAnsi" w:eastAsiaTheme="majorEastAsia" w:hAnsiTheme="majorHAnsi" w:cstheme="majorBidi" w:ascii="Arial" w:hAnsi="Arial"/>
       <w:b/>
       <w:bCs/>
-      <w:color w:val="365F91" w:themeColor="accent1" w:themeShade="BF"/>
-      <w:sz w:val="28"/>
+      <w:color w:val="000000"/>
+      <w:sz w:val="32"/>
       <w:szCs w:val="28"/>
     </w:rPr>
   </w:style>
@@ -714,7 +807,7 @@
       <w:b/>
       <w:bCs/>
       <w:color w:val="000000"/>
-      <w:sz w:val="24"/>
+      <w:sz w:val="26"/>
       <w:szCs w:val="26"/>
     </w:rPr>
   </w:style>

</xml_diff>